<commit_message>
Added FIIN, FIPP and FIBI to invoice and hire-purchase payment method group and bumped version
</commit_message>
<xml_diff>
--- a/docs/Svea_Payment_Gateway_Manual.docx
+++ b/docs/Svea_Payment_Gateway_Manual.docx
@@ -1,6 +1,6 @@
 
 <file path=word/document.xml><?xml version="1.0" encoding="utf-8"?>
-<w:document xmlns:wpc="http://schemas.microsoft.com/office/word/2010/wordprocessingCanvas" xmlns:cx="http://schemas.microsoft.com/office/drawing/2014/chartex" xmlns:cx1="http://schemas.microsoft.com/office/drawing/2015/9/8/chartex" xmlns:cx2="http://schemas.microsoft.com/office/drawing/2015/10/21/chartex" xmlns:cx3="http://schemas.microsoft.com/office/drawing/2016/5/9/chartex" xmlns:cx4="http://schemas.microsoft.com/office/drawing/2016/5/10/chartex" xmlns:cx5="http://schemas.microsoft.com/office/drawing/2016/5/11/chartex" xmlns:cx6="http://schemas.microsoft.com/office/drawing/2016/5/12/chartex" xmlns:cx7="http://schemas.microsoft.com/office/drawing/2016/5/13/chartex" xmlns:cx8="http://schemas.microsoft.com/office/drawing/2016/5/14/chartex" xmlns:mc="http://schemas.openxmlformats.org/markup-compatibility/2006" xmlns:m="http://schemas.openxmlformats.org/officeDocument/2006/math" xmlns:aink="http://schemas.microsoft.com/office/drawing/2016/ink" xmlns:am3d="http://schemas.microsoft.com/office/drawing/2017/model3d" xmlns:oel="http://schemas.microsoft.com/office/2019/extlst" xmlns:r="http://schemas.openxmlformats.org/officeDocument/2006/relationships" xmlns:wp14="http://schemas.microsoft.com/office/word/2010/wordprocessingDrawing" xmlns:wp="http://schemas.openxmlformats.org/drawingml/2006/wordprocessingDrawing" xmlns:wpg="http://schemas.microsoft.com/office/word/2010/wordprocessingGroup" xmlns:wpi="http://schemas.microsoft.com/office/word/2010/wordprocessingInk" xmlns:wps="http://schemas.microsoft.com/office/word/2010/wordprocessingShape" xmlns:o="urn:schemas-microsoft-com:office:office" xmlns:v="urn:schemas-microsoft-com:vml" xmlns:w10="urn:schemas-microsoft-com:office:word" xmlns:w="http://schemas.openxmlformats.org/wordprocessingml/2006/main" xmlns:w14="http://schemas.microsoft.com/office/word/2010/wordml" xmlns:w15="http://schemas.microsoft.com/office/word/2012/wordml" xmlns:w16cei="http://schemas.microsoft.com/office/word/2026/wordml/cei" xmlns:w16cex="http://schemas.microsoft.com/office/word/2018/wordml/cex" xmlns:w16cid="http://schemas.microsoft.com/office/word/2016/wordml/cid" xmlns:w16="http://schemas.microsoft.com/office/word/2018/wordml" xmlns:w16sdtdh="http://schemas.microsoft.com/office/word/2020/wordml/sdtdatahash" xmlns:w16sdtfl="http://schemas.microsoft.com/office/word/2024/wordml/sdtformatlock" xmlns:w16se="http://schemas.microsoft.com/office/word/2015/wordml/symex" xmlns:w16du="http://schemas.microsoft.com/office/word/2023/wordml/word16du" xmlns:wne="http://schemas.microsoft.com/office/word/2006/wordml" mc:Ignorable="w14 w15 w16se w16cid w16 w16cex w16sdtdh w16sdtfl w16du wp14">
+<w:document xmlns:wpc="http://schemas.microsoft.com/office/word/2010/wordprocessingCanvas" xmlns:cx="http://schemas.microsoft.com/office/drawing/2014/chartex" xmlns:cx1="http://schemas.microsoft.com/office/drawing/2015/9/8/chartex" xmlns:cx2="http://schemas.microsoft.com/office/drawing/2015/10/21/chartex" xmlns:cx3="http://schemas.microsoft.com/office/drawing/2016/5/9/chartex" xmlns:cx4="http://schemas.microsoft.com/office/drawing/2016/5/10/chartex" xmlns:cx5="http://schemas.microsoft.com/office/drawing/2016/5/11/chartex" xmlns:cx6="http://schemas.microsoft.com/office/drawing/2016/5/12/chartex" xmlns:cx7="http://schemas.microsoft.com/office/drawing/2016/5/13/chartex" xmlns:cx8="http://schemas.microsoft.com/office/drawing/2016/5/14/chartex" xmlns:mc="http://schemas.openxmlformats.org/markup-compatibility/2006" xmlns:m="http://schemas.openxmlformats.org/officeDocument/2006/math" xmlns:aink="http://schemas.microsoft.com/office/drawing/2016/ink" xmlns:am3d="http://schemas.microsoft.com/office/drawing/2017/model3d" xmlns:oel="http://schemas.microsoft.com/office/2019/extlst" xmlns:r="http://schemas.openxmlformats.org/officeDocument/2006/relationships" xmlns:wp14="http://schemas.microsoft.com/office/word/2010/wordprocessingDrawing" xmlns:wp="http://schemas.openxmlformats.org/drawingml/2006/wordprocessingDrawing" xmlns:wpg="http://schemas.microsoft.com/office/word/2010/wordprocessingGroup" xmlns:wpi="http://schemas.microsoft.com/office/word/2010/wordprocessingInk" xmlns:wps="http://schemas.microsoft.com/office/word/2010/wordprocessingShape" xmlns:o="urn:schemas-microsoft-com:office:office" xmlns:v="urn:schemas-microsoft-com:vml" xmlns:w10="urn:schemas-microsoft-com:office:word" xmlns:w="http://schemas.openxmlformats.org/wordprocessingml/2006/main" xmlns:w14="http://schemas.microsoft.com/office/word/2010/wordml" xmlns:w15="http://schemas.microsoft.com/office/word/2012/wordml" xmlns:w16cex="http://schemas.microsoft.com/office/word/2018/wordml/cex" xmlns:w16cid="http://schemas.microsoft.com/office/word/2016/wordml/cid" xmlns:w16="http://schemas.microsoft.com/office/word/2018/wordml" xmlns:w16sdtdh="http://schemas.microsoft.com/office/word/2020/wordml/sdtdatahash" xmlns:w16sdtfl="http://schemas.microsoft.com/office/word/2024/wordml/sdtformatlock" xmlns:w16se="http://schemas.microsoft.com/office/word/2015/wordml/symex" xmlns:w16du="http://schemas.microsoft.com/office/word/2023/wordml/word16du" xmlns:wne="http://schemas.microsoft.com/office/word/2006/wordml" mc:Ignorable="w14 w15 w16se w16cid w16 w16cex w16sdtdh w16sdtfl w16du wp14">
   <w:body>
     <w:p>
       <w:pPr>
@@ -351,7 +351,7 @@
           <w:iCs/>
           <w:szCs w:val="22"/>
         </w:rPr>
-        <w:t>4</w:t>
+        <w:t>6</w:t>
       </w:r>
     </w:p>
     <w:p>
@@ -411,7 +411,7 @@
         </w:rPr>
         <w:fldChar w:fldCharType="separate"/>
       </w:r>
-      <w:hyperlink w:anchor="_Toc235736382" w:history="1">
+      <w:hyperlink w:anchor="_Toc239360904" w:history="1">
         <w:r>
           <w:rPr>
             <w:rStyle w:val="Hyperlink"/>
@@ -453,7 +453,7 @@
           <w:rPr>
             <w:noProof/>
           </w:rPr>
-          <w:instrText xml:space="preserve"> PAGEREF _Toc235736382 \h </w:instrText>
+          <w:instrText xml:space="preserve"> PAGEREF _Toc239360904 \h </w:instrText>
         </w:r>
         <w:r>
           <w:rPr>
@@ -496,7 +496,7 @@
           <w14:ligatures w14:val="standardContextual"/>
         </w:rPr>
       </w:pPr>
-      <w:hyperlink w:anchor="_Toc235736383" w:history="1">
+      <w:hyperlink w:anchor="_Toc239360905" w:history="1">
         <w:r>
           <w:rPr>
             <w:rStyle w:val="Hyperlink"/>
@@ -538,7 +538,7 @@
           <w:rPr>
             <w:noProof/>
           </w:rPr>
-          <w:instrText xml:space="preserve"> PAGEREF _Toc235736383 \h </w:instrText>
+          <w:instrText xml:space="preserve"> PAGEREF _Toc239360905 \h </w:instrText>
         </w:r>
         <w:r>
           <w:rPr>
@@ -581,7 +581,7 @@
           <w14:ligatures w14:val="standardContextual"/>
         </w:rPr>
       </w:pPr>
-      <w:hyperlink w:anchor="_Toc235736384" w:history="1">
+      <w:hyperlink w:anchor="_Toc239360906" w:history="1">
         <w:r>
           <w:rPr>
             <w:rStyle w:val="Hyperlink"/>
@@ -623,7 +623,7 @@
           <w:rPr>
             <w:noProof/>
           </w:rPr>
-          <w:instrText xml:space="preserve"> PAGEREF _Toc235736384 \h </w:instrText>
+          <w:instrText xml:space="preserve"> PAGEREF _Toc239360906 \h </w:instrText>
         </w:r>
         <w:r>
           <w:rPr>
@@ -666,7 +666,7 @@
           <w14:ligatures w14:val="standardContextual"/>
         </w:rPr>
       </w:pPr>
-      <w:hyperlink w:anchor="_Toc235736385" w:history="1">
+      <w:hyperlink w:anchor="_Toc239360907" w:history="1">
         <w:r>
           <w:rPr>
             <w:rStyle w:val="Hyperlink"/>
@@ -723,7 +723,7 @@
           <w:rPr>
             <w:noProof/>
           </w:rPr>
-          <w:instrText xml:space="preserve"> PAGEREF _Toc235736385 \h </w:instrText>
+          <w:instrText xml:space="preserve"> PAGEREF _Toc239360907 \h </w:instrText>
         </w:r>
         <w:r>
           <w:rPr>
@@ -766,7 +766,7 @@
           <w14:ligatures w14:val="standardContextual"/>
         </w:rPr>
       </w:pPr>
-      <w:hyperlink w:anchor="_Toc235736386" w:history="1">
+      <w:hyperlink w:anchor="_Toc239360908" w:history="1">
         <w:r>
           <w:rPr>
             <w:rStyle w:val="Hyperlink"/>
@@ -808,7 +808,7 @@
           <w:rPr>
             <w:noProof/>
           </w:rPr>
-          <w:instrText xml:space="preserve"> PAGEREF _Toc235736386 \h </w:instrText>
+          <w:instrText xml:space="preserve"> PAGEREF _Toc239360908 \h </w:instrText>
         </w:r>
         <w:r>
           <w:rPr>
@@ -851,7 +851,7 @@
           <w14:ligatures w14:val="standardContextual"/>
         </w:rPr>
       </w:pPr>
-      <w:hyperlink w:anchor="_Toc235736387" w:history="1">
+      <w:hyperlink w:anchor="_Toc239360909" w:history="1">
         <w:r>
           <w:rPr>
             <w:rStyle w:val="Hyperlink"/>
@@ -893,7 +893,7 @@
           <w:rPr>
             <w:noProof/>
           </w:rPr>
-          <w:instrText xml:space="preserve"> PAGEREF _Toc235736387 \h </w:instrText>
+          <w:instrText xml:space="preserve"> PAGEREF _Toc239360909 \h </w:instrText>
         </w:r>
         <w:r>
           <w:rPr>
@@ -936,7 +936,7 @@
           <w14:ligatures w14:val="standardContextual"/>
         </w:rPr>
       </w:pPr>
-      <w:hyperlink w:anchor="_Toc235736388" w:history="1">
+      <w:hyperlink w:anchor="_Toc239360910" w:history="1">
         <w:r>
           <w:rPr>
             <w:rStyle w:val="Hyperlink"/>
@@ -978,7 +978,7 @@
           <w:rPr>
             <w:noProof/>
           </w:rPr>
-          <w:instrText xml:space="preserve"> PAGEREF _Toc235736388 \h </w:instrText>
+          <w:instrText xml:space="preserve"> PAGEREF _Toc239360910 \h </w:instrText>
         </w:r>
         <w:r>
           <w:rPr>
@@ -1021,7 +1021,7 @@
           <w14:ligatures w14:val="standardContextual"/>
         </w:rPr>
       </w:pPr>
-      <w:hyperlink w:anchor="_Toc235736389" w:history="1">
+      <w:hyperlink w:anchor="_Toc239360911" w:history="1">
         <w:r>
           <w:rPr>
             <w:rStyle w:val="Hyperlink"/>
@@ -1063,7 +1063,7 @@
           <w:rPr>
             <w:noProof/>
           </w:rPr>
-          <w:instrText xml:space="preserve"> PAGEREF _Toc235736389 \h </w:instrText>
+          <w:instrText xml:space="preserve"> PAGEREF _Toc239360911 \h </w:instrText>
         </w:r>
         <w:r>
           <w:rPr>
@@ -1106,7 +1106,7 @@
           <w14:ligatures w14:val="standardContextual"/>
         </w:rPr>
       </w:pPr>
-      <w:hyperlink w:anchor="_Toc235736390" w:history="1">
+      <w:hyperlink w:anchor="_Toc239360912" w:history="1">
         <w:r>
           <w:rPr>
             <w:rStyle w:val="Hyperlink"/>
@@ -1148,7 +1148,7 @@
           <w:rPr>
             <w:noProof/>
           </w:rPr>
-          <w:instrText xml:space="preserve"> PAGEREF _Toc235736390 \h </w:instrText>
+          <w:instrText xml:space="preserve"> PAGEREF _Toc239360912 \h </w:instrText>
         </w:r>
         <w:r>
           <w:rPr>
@@ -1191,7 +1191,7 @@
           <w14:ligatures w14:val="standardContextual"/>
         </w:rPr>
       </w:pPr>
-      <w:hyperlink w:anchor="_Toc235736391" w:history="1">
+      <w:hyperlink w:anchor="_Toc239360913" w:history="1">
         <w:r>
           <w:rPr>
             <w:rStyle w:val="Hyperlink"/>
@@ -1233,7 +1233,7 @@
           <w:rPr>
             <w:noProof/>
           </w:rPr>
-          <w:instrText xml:space="preserve"> PAGEREF _Toc235736391 \h </w:instrText>
+          <w:instrText xml:space="preserve"> PAGEREF _Toc239360913 \h </w:instrText>
         </w:r>
         <w:r>
           <w:rPr>
@@ -1276,7 +1276,7 @@
           <w14:ligatures w14:val="standardContextual"/>
         </w:rPr>
       </w:pPr>
-      <w:hyperlink w:anchor="_Toc235736392" w:history="1">
+      <w:hyperlink w:anchor="_Toc239360914" w:history="1">
         <w:r>
           <w:rPr>
             <w:rStyle w:val="Hyperlink"/>
@@ -1318,7 +1318,7 @@
           <w:rPr>
             <w:noProof/>
           </w:rPr>
-          <w:instrText xml:space="preserve"> PAGEREF _Toc235736392 \h </w:instrText>
+          <w:instrText xml:space="preserve"> PAGEREF _Toc239360914 \h </w:instrText>
         </w:r>
         <w:r>
           <w:rPr>
@@ -1361,7 +1361,7 @@
           <w14:ligatures w14:val="standardContextual"/>
         </w:rPr>
       </w:pPr>
-      <w:hyperlink w:anchor="_Toc235736393" w:history="1">
+      <w:hyperlink w:anchor="_Toc239360915" w:history="1">
         <w:r>
           <w:rPr>
             <w:rStyle w:val="Hyperlink"/>
@@ -1403,7 +1403,7 @@
           <w:rPr>
             <w:noProof/>
           </w:rPr>
-          <w:instrText xml:space="preserve"> PAGEREF _Toc235736393 \h </w:instrText>
+          <w:instrText xml:space="preserve"> PAGEREF _Toc239360915 \h </w:instrText>
         </w:r>
         <w:r>
           <w:rPr>
@@ -1446,7 +1446,7 @@
           <w14:ligatures w14:val="standardContextual"/>
         </w:rPr>
       </w:pPr>
-      <w:hyperlink w:anchor="_Toc235736394" w:history="1">
+      <w:hyperlink w:anchor="_Toc239360916" w:history="1">
         <w:r>
           <w:rPr>
             <w:rStyle w:val="Hyperlink"/>
@@ -1488,7 +1488,7 @@
           <w:rPr>
             <w:noProof/>
           </w:rPr>
-          <w:instrText xml:space="preserve"> PAGEREF _Toc235736394 \h </w:instrText>
+          <w:instrText xml:space="preserve"> PAGEREF _Toc239360916 \h </w:instrText>
         </w:r>
         <w:r>
           <w:rPr>
@@ -1531,7 +1531,7 @@
           <w14:ligatures w14:val="standardContextual"/>
         </w:rPr>
       </w:pPr>
-      <w:hyperlink w:anchor="_Toc235736395" w:history="1">
+      <w:hyperlink w:anchor="_Toc239360917" w:history="1">
         <w:r>
           <w:rPr>
             <w:rStyle w:val="Hyperlink"/>
@@ -1573,7 +1573,7 @@
           <w:rPr>
             <w:noProof/>
           </w:rPr>
-          <w:instrText xml:space="preserve"> PAGEREF _Toc235736395 \h </w:instrText>
+          <w:instrText xml:space="preserve"> PAGEREF _Toc239360917 \h </w:instrText>
         </w:r>
         <w:r>
           <w:rPr>
@@ -1616,7 +1616,7 @@
           <w14:ligatures w14:val="standardContextual"/>
         </w:rPr>
       </w:pPr>
-      <w:hyperlink w:anchor="_Toc235736396" w:history="1">
+      <w:hyperlink w:anchor="_Toc239360918" w:history="1">
         <w:r>
           <w:rPr>
             <w:rStyle w:val="Hyperlink"/>
@@ -1658,7 +1658,7 @@
           <w:rPr>
             <w:noProof/>
           </w:rPr>
-          <w:instrText xml:space="preserve"> PAGEREF _Toc235736396 \h </w:instrText>
+          <w:instrText xml:space="preserve"> PAGEREF _Toc239360918 \h </w:instrText>
         </w:r>
         <w:r>
           <w:rPr>
@@ -1701,7 +1701,7 @@
           <w14:ligatures w14:val="standardContextual"/>
         </w:rPr>
       </w:pPr>
-      <w:hyperlink w:anchor="_Toc235736397" w:history="1">
+      <w:hyperlink w:anchor="_Toc239360919" w:history="1">
         <w:r>
           <w:rPr>
             <w:rStyle w:val="Hyperlink"/>
@@ -1743,7 +1743,7 @@
           <w:rPr>
             <w:noProof/>
           </w:rPr>
-          <w:instrText xml:space="preserve"> PAGEREF _Toc235736397 \h </w:instrText>
+          <w:instrText xml:space="preserve"> PAGEREF _Toc239360919 \h </w:instrText>
         </w:r>
         <w:r>
           <w:rPr>
@@ -1786,7 +1786,7 @@
           <w14:ligatures w14:val="standardContextual"/>
         </w:rPr>
       </w:pPr>
-      <w:hyperlink w:anchor="_Toc235736398" w:history="1">
+      <w:hyperlink w:anchor="_Toc239360920" w:history="1">
         <w:r>
           <w:rPr>
             <w:rStyle w:val="Hyperlink"/>
@@ -1828,7 +1828,7 @@
           <w:rPr>
             <w:noProof/>
           </w:rPr>
-          <w:instrText xml:space="preserve"> PAGEREF _Toc235736398 \h </w:instrText>
+          <w:instrText xml:space="preserve"> PAGEREF _Toc239360920 \h </w:instrText>
         </w:r>
         <w:r>
           <w:rPr>
@@ -1871,7 +1871,7 @@
           <w14:ligatures w14:val="standardContextual"/>
         </w:rPr>
       </w:pPr>
-      <w:hyperlink w:anchor="_Toc235736399" w:history="1">
+      <w:hyperlink w:anchor="_Toc239360921" w:history="1">
         <w:r>
           <w:rPr>
             <w:rStyle w:val="Hyperlink"/>
@@ -1913,7 +1913,7 @@
           <w:rPr>
             <w:noProof/>
           </w:rPr>
-          <w:instrText xml:space="preserve"> PAGEREF _Toc235736399 \h </w:instrText>
+          <w:instrText xml:space="preserve"> PAGEREF _Toc239360921 \h </w:instrText>
         </w:r>
         <w:r>
           <w:rPr>
@@ -1956,7 +1956,7 @@
           <w14:ligatures w14:val="standardContextual"/>
         </w:rPr>
       </w:pPr>
-      <w:hyperlink w:anchor="_Toc235736400" w:history="1">
+      <w:hyperlink w:anchor="_Toc239360922" w:history="1">
         <w:r>
           <w:rPr>
             <w:rStyle w:val="Hyperlink"/>
@@ -1998,7 +1998,7 @@
           <w:rPr>
             <w:noProof/>
           </w:rPr>
-          <w:instrText xml:space="preserve"> PAGEREF _Toc235736400 \h </w:instrText>
+          <w:instrText xml:space="preserve"> PAGEREF _Toc239360922 \h </w:instrText>
         </w:r>
         <w:r>
           <w:rPr>
@@ -2041,7 +2041,7 @@
           <w14:ligatures w14:val="standardContextual"/>
         </w:rPr>
       </w:pPr>
-      <w:hyperlink w:anchor="_Toc235736401" w:history="1">
+      <w:hyperlink w:anchor="_Toc239360923" w:history="1">
         <w:r>
           <w:rPr>
             <w:rStyle w:val="Hyperlink"/>
@@ -2083,7 +2083,7 @@
           <w:rPr>
             <w:noProof/>
           </w:rPr>
-          <w:instrText xml:space="preserve"> PAGEREF _Toc235736401 \h </w:instrText>
+          <w:instrText xml:space="preserve"> PAGEREF _Toc239360923 \h </w:instrText>
         </w:r>
         <w:r>
           <w:rPr>
@@ -2126,7 +2126,7 @@
           <w14:ligatures w14:val="standardContextual"/>
         </w:rPr>
       </w:pPr>
-      <w:hyperlink w:anchor="_Toc235736402" w:history="1">
+      <w:hyperlink w:anchor="_Toc239360924" w:history="1">
         <w:r>
           <w:rPr>
             <w:rStyle w:val="Hyperlink"/>
@@ -2168,7 +2168,7 @@
           <w:rPr>
             <w:noProof/>
           </w:rPr>
-          <w:instrText xml:space="preserve"> PAGEREF _Toc235736402 \h </w:instrText>
+          <w:instrText xml:space="preserve"> PAGEREF _Toc239360924 \h </w:instrText>
         </w:r>
         <w:r>
           <w:rPr>
@@ -2211,7 +2211,7 @@
           <w14:ligatures w14:val="standardContextual"/>
         </w:rPr>
       </w:pPr>
-      <w:hyperlink w:anchor="_Toc235736403" w:history="1">
+      <w:hyperlink w:anchor="_Toc239360925" w:history="1">
         <w:r>
           <w:rPr>
             <w:rStyle w:val="Hyperlink"/>
@@ -2253,7 +2253,7 @@
           <w:rPr>
             <w:noProof/>
           </w:rPr>
-          <w:instrText xml:space="preserve"> PAGEREF _Toc235736403 \h </w:instrText>
+          <w:instrText xml:space="preserve"> PAGEREF _Toc239360925 \h </w:instrText>
         </w:r>
         <w:r>
           <w:rPr>
@@ -2296,7 +2296,7 @@
           <w14:ligatures w14:val="standardContextual"/>
         </w:rPr>
       </w:pPr>
-      <w:hyperlink w:anchor="_Toc235736404" w:history="1">
+      <w:hyperlink w:anchor="_Toc239360926" w:history="1">
         <w:r>
           <w:rPr>
             <w:rStyle w:val="Hyperlink"/>
@@ -2338,7 +2338,7 @@
           <w:rPr>
             <w:noProof/>
           </w:rPr>
-          <w:instrText xml:space="preserve"> PAGEREF _Toc235736404 \h </w:instrText>
+          <w:instrText xml:space="preserve"> PAGEREF _Toc239360926 \h </w:instrText>
         </w:r>
         <w:r>
           <w:rPr>
@@ -2381,7 +2381,7 @@
           <w14:ligatures w14:val="standardContextual"/>
         </w:rPr>
       </w:pPr>
-      <w:hyperlink w:anchor="_Toc235736405" w:history="1">
+      <w:hyperlink w:anchor="_Toc239360927" w:history="1">
         <w:r>
           <w:rPr>
             <w:rStyle w:val="Hyperlink"/>
@@ -2423,7 +2423,7 @@
           <w:rPr>
             <w:noProof/>
           </w:rPr>
-          <w:instrText xml:space="preserve"> PAGEREF _Toc235736405 \h </w:instrText>
+          <w:instrText xml:space="preserve"> PAGEREF _Toc239360927 \h </w:instrText>
         </w:r>
         <w:r>
           <w:rPr>
@@ -2466,7 +2466,7 @@
           <w14:ligatures w14:val="standardContextual"/>
         </w:rPr>
       </w:pPr>
-      <w:hyperlink w:anchor="_Toc235736406" w:history="1">
+      <w:hyperlink w:anchor="_Toc239360928" w:history="1">
         <w:r>
           <w:rPr>
             <w:rStyle w:val="Hyperlink"/>
@@ -2508,7 +2508,7 @@
           <w:rPr>
             <w:noProof/>
           </w:rPr>
-          <w:instrText xml:space="preserve"> PAGEREF _Toc235736406 \h </w:instrText>
+          <w:instrText xml:space="preserve"> PAGEREF _Toc239360928 \h </w:instrText>
         </w:r>
         <w:r>
           <w:rPr>
@@ -2551,7 +2551,7 @@
           <w14:ligatures w14:val="standardContextual"/>
         </w:rPr>
       </w:pPr>
-      <w:hyperlink w:anchor="_Toc235736407" w:history="1">
+      <w:hyperlink w:anchor="_Toc239360929" w:history="1">
         <w:r>
           <w:rPr>
             <w:rStyle w:val="Hyperlink"/>
@@ -2593,7 +2593,7 @@
           <w:rPr>
             <w:noProof/>
           </w:rPr>
-          <w:instrText xml:space="preserve"> PAGEREF _Toc235736407 \h </w:instrText>
+          <w:instrText xml:space="preserve"> PAGEREF _Toc239360929 \h </w:instrText>
         </w:r>
         <w:r>
           <w:rPr>
@@ -2636,7 +2636,7 @@
           <w14:ligatures w14:val="standardContextual"/>
         </w:rPr>
       </w:pPr>
-      <w:hyperlink w:anchor="_Toc235736408" w:history="1">
+      <w:hyperlink w:anchor="_Toc239360930" w:history="1">
         <w:r>
           <w:rPr>
             <w:rStyle w:val="Hyperlink"/>
@@ -2678,7 +2678,7 @@
           <w:rPr>
             <w:noProof/>
           </w:rPr>
-          <w:instrText xml:space="preserve"> PAGEREF _Toc235736408 \h </w:instrText>
+          <w:instrText xml:space="preserve"> PAGEREF _Toc239360930 \h </w:instrText>
         </w:r>
         <w:r>
           <w:rPr>
@@ -2721,7 +2721,7 @@
           <w14:ligatures w14:val="standardContextual"/>
         </w:rPr>
       </w:pPr>
-      <w:hyperlink w:anchor="_Toc235736409" w:history="1">
+      <w:hyperlink w:anchor="_Toc239360931" w:history="1">
         <w:r>
           <w:rPr>
             <w:rStyle w:val="Hyperlink"/>
@@ -2763,7 +2763,7 @@
           <w:rPr>
             <w:noProof/>
           </w:rPr>
-          <w:instrText xml:space="preserve"> PAGEREF _Toc235736409 \h </w:instrText>
+          <w:instrText xml:space="preserve"> PAGEREF _Toc239360931 \h </w:instrText>
         </w:r>
         <w:r>
           <w:rPr>
@@ -2806,7 +2806,7 @@
           <w14:ligatures w14:val="standardContextual"/>
         </w:rPr>
       </w:pPr>
-      <w:hyperlink w:anchor="_Toc235736410" w:history="1">
+      <w:hyperlink w:anchor="_Toc239360932" w:history="1">
         <w:r>
           <w:rPr>
             <w:rStyle w:val="Hyperlink"/>
@@ -2848,7 +2848,7 @@
           <w:rPr>
             <w:noProof/>
           </w:rPr>
-          <w:instrText xml:space="preserve"> PAGEREF _Toc235736410 \h </w:instrText>
+          <w:instrText xml:space="preserve"> PAGEREF _Toc239360932 \h </w:instrText>
         </w:r>
         <w:r>
           <w:rPr>
@@ -2891,7 +2891,7 @@
           <w14:ligatures w14:val="standardContextual"/>
         </w:rPr>
       </w:pPr>
-      <w:hyperlink w:anchor="_Toc235736411" w:history="1">
+      <w:hyperlink w:anchor="_Toc239360933" w:history="1">
         <w:r>
           <w:rPr>
             <w:rStyle w:val="Hyperlink"/>
@@ -2933,7 +2933,7 @@
           <w:rPr>
             <w:noProof/>
           </w:rPr>
-          <w:instrText xml:space="preserve"> PAGEREF _Toc235736411 \h </w:instrText>
+          <w:instrText xml:space="preserve"> PAGEREF _Toc239360933 \h </w:instrText>
         </w:r>
         <w:r>
           <w:rPr>
@@ -2976,7 +2976,7 @@
           <w14:ligatures w14:val="standardContextual"/>
         </w:rPr>
       </w:pPr>
-      <w:hyperlink w:anchor="_Toc235736412" w:history="1">
+      <w:hyperlink w:anchor="_Toc239360934" w:history="1">
         <w:r>
           <w:rPr>
             <w:rStyle w:val="Hyperlink"/>
@@ -3018,7 +3018,7 @@
           <w:rPr>
             <w:noProof/>
           </w:rPr>
-          <w:instrText xml:space="preserve"> PAGEREF _Toc235736412 \h </w:instrText>
+          <w:instrText xml:space="preserve"> PAGEREF _Toc239360934 \h </w:instrText>
         </w:r>
         <w:r>
           <w:rPr>
@@ -3061,7 +3061,7 @@
           <w14:ligatures w14:val="standardContextual"/>
         </w:rPr>
       </w:pPr>
-      <w:hyperlink w:anchor="_Toc235736413" w:history="1">
+      <w:hyperlink w:anchor="_Toc239360935" w:history="1">
         <w:r>
           <w:rPr>
             <w:rStyle w:val="Hyperlink"/>
@@ -3103,7 +3103,7 @@
           <w:rPr>
             <w:noProof/>
           </w:rPr>
-          <w:instrText xml:space="preserve"> PAGEREF _Toc235736413 \h </w:instrText>
+          <w:instrText xml:space="preserve"> PAGEREF _Toc239360935 \h </w:instrText>
         </w:r>
         <w:r>
           <w:rPr>
@@ -3146,7 +3146,7 @@
           <w14:ligatures w14:val="standardContextual"/>
         </w:rPr>
       </w:pPr>
-      <w:hyperlink w:anchor="_Toc235736414" w:history="1">
+      <w:hyperlink w:anchor="_Toc239360936" w:history="1">
         <w:r>
           <w:rPr>
             <w:rStyle w:val="Hyperlink"/>
@@ -3188,7 +3188,7 @@
           <w:rPr>
             <w:noProof/>
           </w:rPr>
-          <w:instrText xml:space="preserve"> PAGEREF _Toc235736414 \h </w:instrText>
+          <w:instrText xml:space="preserve"> PAGEREF _Toc239360936 \h </w:instrText>
         </w:r>
         <w:r>
           <w:rPr>
@@ -3231,7 +3231,7 @@
           <w14:ligatures w14:val="standardContextual"/>
         </w:rPr>
       </w:pPr>
-      <w:hyperlink w:anchor="_Toc235736415" w:history="1">
+      <w:hyperlink w:anchor="_Toc239360937" w:history="1">
         <w:r>
           <w:rPr>
             <w:rStyle w:val="Hyperlink"/>
@@ -3273,7 +3273,7 @@
           <w:rPr>
             <w:noProof/>
           </w:rPr>
-          <w:instrText xml:space="preserve"> PAGEREF _Toc235736415 \h </w:instrText>
+          <w:instrText xml:space="preserve"> PAGEREF _Toc239360937 \h </w:instrText>
         </w:r>
         <w:r>
           <w:rPr>
@@ -3324,7 +3324,7 @@
       <w:bookmarkStart w:id="5" w:name="_Toc10741265"/>
       <w:bookmarkStart w:id="6" w:name="_Toc10646639"/>
       <w:bookmarkStart w:id="7" w:name="__RefHeading__2268_1681451042"/>
-      <w:bookmarkStart w:id="8" w:name="_Toc235736382"/>
+      <w:bookmarkStart w:id="8" w:name="_Toc239360904"/>
       <w:r>
         <w:lastRenderedPageBreak/>
         <w:t xml:space="preserve">Version </w:t>
@@ -3416,7 +3416,7 @@
       <w:pPr>
         <w:pStyle w:val="Heading1"/>
       </w:pPr>
-      <w:bookmarkStart w:id="16" w:name="_Toc235736383"/>
+      <w:bookmarkStart w:id="16" w:name="_Toc239360905"/>
       <w:r>
         <w:t>Service requirements</w:t>
       </w:r>
@@ -3475,7 +3475,7 @@
       <w:bookmarkStart w:id="21" w:name="_Toc10743687"/>
       <w:bookmarkStart w:id="22" w:name="_Toc10741267"/>
       <w:bookmarkStart w:id="23" w:name="_Toc10646641"/>
-      <w:bookmarkStart w:id="24" w:name="_Toc235736384"/>
+      <w:bookmarkStart w:id="24" w:name="_Toc239360906"/>
       <w:r>
         <w:t>System requirements</w:t>
       </w:r>
@@ -3642,6 +3642,9 @@
             <w:r>
               <w:t>, 10.x</w:t>
             </w:r>
+            <w:r>
+              <w:t>, 11.x</w:t>
+            </w:r>
           </w:p>
         </w:tc>
       </w:tr>
@@ -3835,17 +3838,9 @@
     </w:p>
     <w:p>
       <w:pPr>
-        <w:pStyle w:val="Textbody"/>
-      </w:pPr>
-      <w:r>
-        <w:t>There is no guarantee that the plugin is fully functional in any other environment.</w:t>
-      </w:r>
-    </w:p>
-    <w:p>
-      <w:pPr>
         <w:pStyle w:val="Heading2"/>
       </w:pPr>
-      <w:bookmarkStart w:id="25" w:name="_Toc235736385"/>
+      <w:bookmarkStart w:id="25" w:name="_Toc239360907"/>
       <w:r>
         <w:t>Supported 3</w:t>
       </w:r>
@@ -3959,7 +3954,7 @@
       <w:bookmarkStart w:id="30" w:name="_Toc10743689"/>
       <w:bookmarkStart w:id="31" w:name="_Toc10741269"/>
       <w:bookmarkStart w:id="32" w:name="_Toc10646643"/>
-      <w:bookmarkStart w:id="33" w:name="_Toc235736386"/>
+      <w:bookmarkStart w:id="33" w:name="_Toc239360908"/>
       <w:r>
         <w:lastRenderedPageBreak/>
         <w:t>Installation</w:t>
@@ -4008,7 +4003,7 @@
       <w:bookmarkStart w:id="38" w:name="_Toc11253827"/>
       <w:bookmarkStart w:id="39" w:name="_Toc11353126"/>
       <w:bookmarkStart w:id="40" w:name="_Toc11353200"/>
-      <w:bookmarkStart w:id="41" w:name="_Toc235736387"/>
+      <w:bookmarkStart w:id="41" w:name="_Toc239360909"/>
       <w:r>
         <w:t xml:space="preserve">Installing the </w:t>
       </w:r>
@@ -4541,7 +4536,7 @@
       <w:bookmarkStart w:id="47" w:name="_Toc10741270"/>
       <w:bookmarkStart w:id="48" w:name="_Toc10646644"/>
       <w:bookmarkStart w:id="49" w:name="__RefHeading__1414_1801812706"/>
-      <w:bookmarkStart w:id="50" w:name="_Toc235736388"/>
+      <w:bookmarkStart w:id="50" w:name="_Toc239360910"/>
       <w:r>
         <w:lastRenderedPageBreak/>
         <w:t xml:space="preserve">Upgrading </w:t>
@@ -4732,7 +4727,7 @@
       <w:pPr>
         <w:pStyle w:val="Heading1"/>
       </w:pPr>
-      <w:bookmarkStart w:id="59" w:name="_Toc235736389"/>
+      <w:bookmarkStart w:id="59" w:name="_Toc239360911"/>
       <w:r>
         <w:lastRenderedPageBreak/>
         <w:t>Configuration</w:t>
@@ -4976,7 +4971,7 @@
       <w:bookmarkStart w:id="64" w:name="_Toc10743693"/>
       <w:bookmarkStart w:id="65" w:name="_Toc10741273"/>
       <w:bookmarkStart w:id="66" w:name="_Toc10646647"/>
-      <w:bookmarkStart w:id="67" w:name="_Toc235736390"/>
+      <w:bookmarkStart w:id="67" w:name="_Toc239360912"/>
       <w:r>
         <w:t>Enable / Disable</w:t>
       </w:r>
@@ -5003,7 +4998,7 @@
       </w:pPr>
       <w:bookmarkStart w:id="68" w:name="_Ref216538732"/>
       <w:bookmarkStart w:id="69" w:name="_Ref216539648"/>
-      <w:bookmarkStart w:id="70" w:name="_Toc235736391"/>
+      <w:bookmarkStart w:id="70" w:name="_Toc239360913"/>
       <w:r>
         <w:t>Enable Block mode</w:t>
       </w:r>
@@ -5067,7 +5062,7 @@
       <w:bookmarkStart w:id="76" w:name="_Toc10743694"/>
       <w:bookmarkStart w:id="77" w:name="_Toc10741274"/>
       <w:bookmarkStart w:id="78" w:name="_Toc10646648"/>
-      <w:bookmarkStart w:id="79" w:name="_Toc235736392"/>
+      <w:bookmarkStart w:id="79" w:name="_Toc239360914"/>
       <w:r>
         <w:lastRenderedPageBreak/>
         <w:t>Redirect to Svea’s Payment Method Selection Page</w:t>
@@ -5113,7 +5108,7 @@
       <w:pPr>
         <w:pStyle w:val="Heading2"/>
       </w:pPr>
-      <w:bookmarkStart w:id="80" w:name="_Toc235736393"/>
+      <w:bookmarkStart w:id="80" w:name="_Toc239360915"/>
       <w:r>
         <w:t xml:space="preserve">Redirect to Svea’s Payment Method </w:t>
       </w:r>
@@ -5160,7 +5155,7 @@
       <w:bookmarkStart w:id="85" w:name="_Toc10743695"/>
       <w:bookmarkStart w:id="86" w:name="_Toc10741275"/>
       <w:bookmarkStart w:id="87" w:name="_Toc10646649"/>
-      <w:bookmarkStart w:id="88" w:name="_Toc235736394"/>
+      <w:bookmarkStart w:id="88" w:name="_Toc239360916"/>
       <w:r>
         <w:t>Customer message</w:t>
       </w:r>
@@ -5192,7 +5187,7 @@
       <w:bookmarkStart w:id="93" w:name="_Toc10743696"/>
       <w:bookmarkStart w:id="94" w:name="_Toc10741276"/>
       <w:bookmarkStart w:id="95" w:name="_Toc10646650"/>
-      <w:bookmarkStart w:id="96" w:name="_Toc235736395"/>
+      <w:bookmarkStart w:id="96" w:name="_Toc239360917"/>
       <w:r>
         <w:t>Payment handling fees</w:t>
       </w:r>
@@ -5235,7 +5230,7 @@
       <w:pPr>
         <w:pStyle w:val="Heading2"/>
       </w:pPr>
-      <w:bookmarkStart w:id="97" w:name="_Toc235736396"/>
+      <w:bookmarkStart w:id="97" w:name="_Toc239360918"/>
       <w:r>
         <w:t>Payment handling fee tax class</w:t>
       </w:r>
@@ -5260,7 +5255,7 @@
       <w:bookmarkStart w:id="102" w:name="_Toc10743698"/>
       <w:bookmarkStart w:id="103" w:name="_Toc10741278"/>
       <w:bookmarkStart w:id="104" w:name="_Toc10646652"/>
-      <w:bookmarkStart w:id="105" w:name="_Toc235736397"/>
+      <w:bookmarkStart w:id="105" w:name="_Toc239360919"/>
       <w:r>
         <w:t>Gateway</w:t>
       </w:r>
@@ -5334,7 +5329,7 @@
       <w:pPr>
         <w:pStyle w:val="Heading2"/>
       </w:pPr>
-      <w:bookmarkStart w:id="106" w:name="_Toc235736398"/>
+      <w:bookmarkStart w:id="106" w:name="_Toc239360920"/>
       <w:r>
         <w:t xml:space="preserve">Seller </w:t>
       </w:r>
@@ -5426,7 +5421,7 @@
       <w:bookmarkStart w:id="118" w:name="_Toc10743699"/>
       <w:bookmarkStart w:id="119" w:name="_Toc10741279"/>
       <w:bookmarkStart w:id="120" w:name="_Toc10646653"/>
-      <w:bookmarkStart w:id="121" w:name="_Toc235736399"/>
+      <w:bookmarkStart w:id="121" w:name="_Toc239360921"/>
       <w:r>
         <w:t>Payment</w:t>
       </w:r>
@@ -5477,7 +5472,7 @@
       <w:r>
         <w:t xml:space="preserve"> </w:t>
       </w:r>
-      <w:bookmarkStart w:id="122" w:name="_Toc235736400"/>
+      <w:bookmarkStart w:id="122" w:name="_Toc239360922"/>
       <w:r>
         <w:t xml:space="preserve">Send </w:t>
       </w:r>
@@ -5539,7 +5534,7 @@
       <w:pPr>
         <w:pStyle w:val="Heading2"/>
       </w:pPr>
-      <w:bookmarkStart w:id="123" w:name="_Toc235736401"/>
+      <w:bookmarkStart w:id="123" w:name="_Toc239360923"/>
       <w:r>
         <w:t>Send delivery confirmation only for specific payment methods</w:t>
       </w:r>
@@ -5629,7 +5624,7 @@
       <w:pPr>
         <w:pStyle w:val="Heading2"/>
       </w:pPr>
-      <w:bookmarkStart w:id="124" w:name="_Toc235736402"/>
+      <w:bookmarkStart w:id="124" w:name="_Toc239360924"/>
       <w:r>
         <w:lastRenderedPageBreak/>
         <w:t>Part Payment widget</w:t>
@@ -5828,7 +5823,7 @@
         <w:pStyle w:val="Heading1"/>
       </w:pPr>
       <w:bookmarkStart w:id="125" w:name="_Payment_method_views"/>
-      <w:bookmarkStart w:id="126" w:name="_Toc235736403"/>
+      <w:bookmarkStart w:id="126" w:name="_Toc239360925"/>
       <w:bookmarkEnd w:id="125"/>
       <w:r>
         <w:lastRenderedPageBreak/>
@@ -5994,7 +5989,7 @@
         <w:pStyle w:val="Heading2"/>
       </w:pPr>
       <w:bookmarkStart w:id="127" w:name="_Ref216538941"/>
-      <w:bookmarkStart w:id="128" w:name="_Toc235736404"/>
+      <w:bookmarkStart w:id="128" w:name="_Toc239360926"/>
       <w:r>
         <w:t>Redirect to Svea Payments</w:t>
       </w:r>
@@ -6060,7 +6055,7 @@
       <w:pPr>
         <w:pStyle w:val="Heading2"/>
       </w:pPr>
-      <w:bookmarkStart w:id="129" w:name="_Toc235736405"/>
+      <w:bookmarkStart w:id="129" w:name="_Toc239360927"/>
       <w:r>
         <w:t>Block mode theme view</w:t>
       </w:r>
@@ -6297,7 +6292,7 @@
       <w:pPr>
         <w:pStyle w:val="Heading2"/>
       </w:pPr>
-      <w:bookmarkStart w:id="130" w:name="_Toc235736406"/>
+      <w:bookmarkStart w:id="130" w:name="_Toc239360928"/>
       <w:r>
         <w:lastRenderedPageBreak/>
         <w:t>Collated payment method view</w:t>
@@ -6478,7 +6473,7 @@
       <w:pPr>
         <w:pStyle w:val="Heading2"/>
       </w:pPr>
-      <w:bookmarkStart w:id="138" w:name="_Toc235736407"/>
+      <w:bookmarkStart w:id="138" w:name="_Toc239360929"/>
       <w:r>
         <w:lastRenderedPageBreak/>
         <w:t>Separate payment methods</w:t>
@@ -6618,7 +6613,7 @@
       <w:pPr>
         <w:pStyle w:val="Heading1"/>
       </w:pPr>
-      <w:bookmarkStart w:id="139" w:name="_Toc235736408"/>
+      <w:bookmarkStart w:id="139" w:name="_Toc239360930"/>
       <w:r>
         <w:lastRenderedPageBreak/>
         <w:t>Language customization</w:t>
@@ -6705,7 +6700,7 @@
       <w:bookmarkStart w:id="145" w:name="_Toc10741283"/>
       <w:bookmarkStart w:id="146" w:name="_Toc10646657"/>
       <w:bookmarkStart w:id="147" w:name="__RefHeading__1978_1771778893"/>
-      <w:bookmarkStart w:id="148" w:name="_Toc235736409"/>
+      <w:bookmarkStart w:id="148" w:name="_Toc239360931"/>
       <w:r>
         <w:t>Testing the installation</w:t>
       </w:r>
@@ -6738,7 +6733,7 @@
       <w:bookmarkStart w:id="153" w:name="_Toc10743704"/>
       <w:bookmarkStart w:id="154" w:name="_Toc10741284"/>
       <w:bookmarkStart w:id="155" w:name="_Toc10646658"/>
-      <w:bookmarkStart w:id="156" w:name="_Toc235736410"/>
+      <w:bookmarkStart w:id="156" w:name="_Toc239360932"/>
       <w:r>
         <w:t>Testing in Svea Payments test environment</w:t>
       </w:r>
@@ -6841,7 +6836,7 @@
       <w:bookmarkStart w:id="161" w:name="_Toc10743706"/>
       <w:bookmarkStart w:id="162" w:name="_Toc10741286"/>
       <w:bookmarkStart w:id="163" w:name="_Toc10646660"/>
-      <w:bookmarkStart w:id="164" w:name="_Toc235736411"/>
+      <w:bookmarkStart w:id="164" w:name="_Toc239360933"/>
       <w:r>
         <w:lastRenderedPageBreak/>
         <w:t>Administration</w:t>
@@ -6887,7 +6882,7 @@
       <w:r>
         <w:t xml:space="preserve"> </w:t>
       </w:r>
-      <w:bookmarkStart w:id="166" w:name="_Toc235736412"/>
+      <w:bookmarkStart w:id="166" w:name="_Toc239360934"/>
       <w:r>
         <w:t>Payment verification</w:t>
       </w:r>
@@ -6924,7 +6919,7 @@
       <w:r>
         <w:t xml:space="preserve"> </w:t>
       </w:r>
-      <w:bookmarkStart w:id="174" w:name="_Toc235736413"/>
+      <w:bookmarkStart w:id="174" w:name="_Toc239360935"/>
       <w:r>
         <w:t>R</w:t>
       </w:r>
@@ -7022,7 +7017,7 @@
       <w:pPr>
         <w:pStyle w:val="Heading1"/>
       </w:pPr>
-      <w:bookmarkStart w:id="176" w:name="_Toc235736414"/>
+      <w:bookmarkStart w:id="176" w:name="_Toc239360936"/>
       <w:r>
         <w:lastRenderedPageBreak/>
         <w:t>About HPOS</w:t>
@@ -7258,7 +7253,7 @@
       <w:bookmarkStart w:id="182" w:name="_Toc11253824"/>
       <w:bookmarkStart w:id="183" w:name="_Toc11353123"/>
       <w:bookmarkStart w:id="184" w:name="_Toc11353197"/>
-      <w:bookmarkStart w:id="185" w:name="_Toc235736415"/>
+      <w:bookmarkStart w:id="185" w:name="_Toc239360937"/>
       <w:bookmarkEnd w:id="177"/>
       <w:r>
         <w:t>Package contents</w:t>
@@ -7937,7 +7932,7 @@
 </file>
 
 <file path=word/endnotes.xml><?xml version="1.0" encoding="utf-8"?>
-<w:endnotes xmlns:wpc="http://schemas.microsoft.com/office/word/2010/wordprocessingCanvas" xmlns:cx="http://schemas.microsoft.com/office/drawing/2014/chartex" xmlns:cx1="http://schemas.microsoft.com/office/drawing/2015/9/8/chartex" xmlns:cx2="http://schemas.microsoft.com/office/drawing/2015/10/21/chartex" xmlns:cx3="http://schemas.microsoft.com/office/drawing/2016/5/9/chartex" xmlns:cx4="http://schemas.microsoft.com/office/drawing/2016/5/10/chartex" xmlns:cx5="http://schemas.microsoft.com/office/drawing/2016/5/11/chartex" xmlns:cx6="http://schemas.microsoft.com/office/drawing/2016/5/12/chartex" xmlns:cx7="http://schemas.microsoft.com/office/drawing/2016/5/13/chartex" xmlns:cx8="http://schemas.microsoft.com/office/drawing/2016/5/14/chartex" xmlns:mc="http://schemas.openxmlformats.org/markup-compatibility/2006" xmlns:m="http://schemas.openxmlformats.org/officeDocument/2006/math" xmlns:aink="http://schemas.microsoft.com/office/drawing/2016/ink" xmlns:am3d="http://schemas.microsoft.com/office/drawing/2017/model3d" xmlns:oel="http://schemas.microsoft.com/office/2019/extlst" xmlns:r="http://schemas.openxmlformats.org/officeDocument/2006/relationships" xmlns:wp14="http://schemas.microsoft.com/office/word/2010/wordprocessingDrawing" xmlns:wp="http://schemas.openxmlformats.org/drawingml/2006/wordprocessingDrawing" xmlns:wpg="http://schemas.microsoft.com/office/word/2010/wordprocessingGroup" xmlns:wpi="http://schemas.microsoft.com/office/word/2010/wordprocessingInk" xmlns:wps="http://schemas.microsoft.com/office/word/2010/wordprocessingShape" xmlns:o="urn:schemas-microsoft-com:office:office" xmlns:v="urn:schemas-microsoft-com:vml" xmlns:w10="urn:schemas-microsoft-com:office:word" xmlns:w="http://schemas.openxmlformats.org/wordprocessingml/2006/main" xmlns:w14="http://schemas.microsoft.com/office/word/2010/wordml" xmlns:w15="http://schemas.microsoft.com/office/word/2012/wordml" xmlns:w16cei="http://schemas.microsoft.com/office/word/2026/wordml/cei" xmlns:w16cex="http://schemas.microsoft.com/office/word/2018/wordml/cex" xmlns:w16cid="http://schemas.microsoft.com/office/word/2016/wordml/cid" xmlns:w16="http://schemas.microsoft.com/office/word/2018/wordml" xmlns:w16sdtdh="http://schemas.microsoft.com/office/word/2020/wordml/sdtdatahash" xmlns:w16sdtfl="http://schemas.microsoft.com/office/word/2024/wordml/sdtformatlock" xmlns:w16se="http://schemas.microsoft.com/office/word/2015/wordml/symex" xmlns:w16du="http://schemas.microsoft.com/office/word/2023/wordml/word16du" xmlns:wne="http://schemas.microsoft.com/office/word/2006/wordml" mc:Ignorable="w14 w15 w16se w16cid w16 w16cex w16sdtdh w16sdtfl w16du wp14">
+<w:endnotes xmlns:wpc="http://schemas.microsoft.com/office/word/2010/wordprocessingCanvas" xmlns:cx="http://schemas.microsoft.com/office/drawing/2014/chartex" xmlns:cx1="http://schemas.microsoft.com/office/drawing/2015/9/8/chartex" xmlns:cx2="http://schemas.microsoft.com/office/drawing/2015/10/21/chartex" xmlns:cx3="http://schemas.microsoft.com/office/drawing/2016/5/9/chartex" xmlns:cx4="http://schemas.microsoft.com/office/drawing/2016/5/10/chartex" xmlns:cx5="http://schemas.microsoft.com/office/drawing/2016/5/11/chartex" xmlns:cx6="http://schemas.microsoft.com/office/drawing/2016/5/12/chartex" xmlns:cx7="http://schemas.microsoft.com/office/drawing/2016/5/13/chartex" xmlns:cx8="http://schemas.microsoft.com/office/drawing/2016/5/14/chartex" xmlns:mc="http://schemas.openxmlformats.org/markup-compatibility/2006" xmlns:m="http://schemas.openxmlformats.org/officeDocument/2006/math" xmlns:aink="http://schemas.microsoft.com/office/drawing/2016/ink" xmlns:am3d="http://schemas.microsoft.com/office/drawing/2017/model3d" xmlns:oel="http://schemas.microsoft.com/office/2019/extlst" xmlns:r="http://schemas.openxmlformats.org/officeDocument/2006/relationships" xmlns:wp14="http://schemas.microsoft.com/office/word/2010/wordprocessingDrawing" xmlns:wp="http://schemas.openxmlformats.org/drawingml/2006/wordprocessingDrawing" xmlns:wpg="http://schemas.microsoft.com/office/word/2010/wordprocessingGroup" xmlns:wpi="http://schemas.microsoft.com/office/word/2010/wordprocessingInk" xmlns:wps="http://schemas.microsoft.com/office/word/2010/wordprocessingShape" xmlns:o="urn:schemas-microsoft-com:office:office" xmlns:v="urn:schemas-microsoft-com:vml" xmlns:w10="urn:schemas-microsoft-com:office:word" xmlns:w="http://schemas.openxmlformats.org/wordprocessingml/2006/main" xmlns:w14="http://schemas.microsoft.com/office/word/2010/wordml" xmlns:w15="http://schemas.microsoft.com/office/word/2012/wordml" xmlns:w16cex="http://schemas.microsoft.com/office/word/2018/wordml/cex" xmlns:w16cid="http://schemas.microsoft.com/office/word/2016/wordml/cid" xmlns:w16="http://schemas.microsoft.com/office/word/2018/wordml" xmlns:w16sdtdh="http://schemas.microsoft.com/office/word/2020/wordml/sdtdatahash" xmlns:w16sdtfl="http://schemas.microsoft.com/office/word/2024/wordml/sdtformatlock" xmlns:w16se="http://schemas.microsoft.com/office/word/2015/wordml/symex" xmlns:w16du="http://schemas.microsoft.com/office/word/2023/wordml/word16du" xmlns:wne="http://schemas.microsoft.com/office/word/2006/wordml" mc:Ignorable="w14 w15 w16se w16cid w16 w16cex w16sdtdh w16sdtfl w16du wp14">
   <w:endnote w:type="separator" w:id="-1">
     <w:p>
       <w:r>
@@ -7956,7 +7951,7 @@
 </file>
 
 <file path=word/footer1.xml><?xml version="1.0" encoding="utf-8"?>
-<w:ftr xmlns:wpc="http://schemas.microsoft.com/office/word/2010/wordprocessingCanvas" xmlns:cx="http://schemas.microsoft.com/office/drawing/2014/chartex" xmlns:cx1="http://schemas.microsoft.com/office/drawing/2015/9/8/chartex" xmlns:cx2="http://schemas.microsoft.com/office/drawing/2015/10/21/chartex" xmlns:cx3="http://schemas.microsoft.com/office/drawing/2016/5/9/chartex" xmlns:cx4="http://schemas.microsoft.com/office/drawing/2016/5/10/chartex" xmlns:cx5="http://schemas.microsoft.com/office/drawing/2016/5/11/chartex" xmlns:cx6="http://schemas.microsoft.com/office/drawing/2016/5/12/chartex" xmlns:cx7="http://schemas.microsoft.com/office/drawing/2016/5/13/chartex" xmlns:cx8="http://schemas.microsoft.com/office/drawing/2016/5/14/chartex" xmlns:mc="http://schemas.openxmlformats.org/markup-compatibility/2006" xmlns:m="http://schemas.openxmlformats.org/officeDocument/2006/math" xmlns:aink="http://schemas.microsoft.com/office/drawing/2016/ink" xmlns:am3d="http://schemas.microsoft.com/office/drawing/2017/model3d" xmlns:oel="http://schemas.microsoft.com/office/2019/extlst" xmlns:r="http://schemas.openxmlformats.org/officeDocument/2006/relationships" xmlns:wp14="http://schemas.microsoft.com/office/word/2010/wordprocessingDrawing" xmlns:wp="http://schemas.openxmlformats.org/drawingml/2006/wordprocessingDrawing" xmlns:wpg="http://schemas.microsoft.com/office/word/2010/wordprocessingGroup" xmlns:wpi="http://schemas.microsoft.com/office/word/2010/wordprocessingInk" xmlns:wps="http://schemas.microsoft.com/office/word/2010/wordprocessingShape" xmlns:o="urn:schemas-microsoft-com:office:office" xmlns:v="urn:schemas-microsoft-com:vml" xmlns:w10="urn:schemas-microsoft-com:office:word" xmlns:w="http://schemas.openxmlformats.org/wordprocessingml/2006/main" xmlns:w14="http://schemas.microsoft.com/office/word/2010/wordml" xmlns:w15="http://schemas.microsoft.com/office/word/2012/wordml" xmlns:w16cei="http://schemas.microsoft.com/office/word/2026/wordml/cei" xmlns:w16cex="http://schemas.microsoft.com/office/word/2018/wordml/cex" xmlns:w16cid="http://schemas.microsoft.com/office/word/2016/wordml/cid" xmlns:w16="http://schemas.microsoft.com/office/word/2018/wordml" xmlns:w16sdtdh="http://schemas.microsoft.com/office/word/2020/wordml/sdtdatahash" xmlns:w16sdtfl="http://schemas.microsoft.com/office/word/2024/wordml/sdtformatlock" xmlns:w16se="http://schemas.microsoft.com/office/word/2015/wordml/symex" xmlns:w16du="http://schemas.microsoft.com/office/word/2023/wordml/word16du" xmlns:wne="http://schemas.microsoft.com/office/word/2006/wordml" mc:Ignorable="w14 w15 w16se w16cid w16 w16cex w16sdtdh w16sdtfl w16du wp14">
+<w:ftr xmlns:wpc="http://schemas.microsoft.com/office/word/2010/wordprocessingCanvas" xmlns:cx="http://schemas.microsoft.com/office/drawing/2014/chartex" xmlns:cx1="http://schemas.microsoft.com/office/drawing/2015/9/8/chartex" xmlns:cx2="http://schemas.microsoft.com/office/drawing/2015/10/21/chartex" xmlns:cx3="http://schemas.microsoft.com/office/drawing/2016/5/9/chartex" xmlns:cx4="http://schemas.microsoft.com/office/drawing/2016/5/10/chartex" xmlns:cx5="http://schemas.microsoft.com/office/drawing/2016/5/11/chartex" xmlns:cx6="http://schemas.microsoft.com/office/drawing/2016/5/12/chartex" xmlns:cx7="http://schemas.microsoft.com/office/drawing/2016/5/13/chartex" xmlns:cx8="http://schemas.microsoft.com/office/drawing/2016/5/14/chartex" xmlns:mc="http://schemas.openxmlformats.org/markup-compatibility/2006" xmlns:m="http://schemas.openxmlformats.org/officeDocument/2006/math" xmlns:aink="http://schemas.microsoft.com/office/drawing/2016/ink" xmlns:am3d="http://schemas.microsoft.com/office/drawing/2017/model3d" xmlns:oel="http://schemas.microsoft.com/office/2019/extlst" xmlns:r="http://schemas.openxmlformats.org/officeDocument/2006/relationships" xmlns:wp14="http://schemas.microsoft.com/office/word/2010/wordprocessingDrawing" xmlns:wp="http://schemas.openxmlformats.org/drawingml/2006/wordprocessingDrawing" xmlns:wpg="http://schemas.microsoft.com/office/word/2010/wordprocessingGroup" xmlns:wpi="http://schemas.microsoft.com/office/word/2010/wordprocessingInk" xmlns:wps="http://schemas.microsoft.com/office/word/2010/wordprocessingShape" xmlns:o="urn:schemas-microsoft-com:office:office" xmlns:v="urn:schemas-microsoft-com:vml" xmlns:w10="urn:schemas-microsoft-com:office:word" xmlns:w="http://schemas.openxmlformats.org/wordprocessingml/2006/main" xmlns:w14="http://schemas.microsoft.com/office/word/2010/wordml" xmlns:w15="http://schemas.microsoft.com/office/word/2012/wordml" xmlns:w16cex="http://schemas.microsoft.com/office/word/2018/wordml/cex" xmlns:w16cid="http://schemas.microsoft.com/office/word/2016/wordml/cid" xmlns:w16="http://schemas.microsoft.com/office/word/2018/wordml" xmlns:w16sdtdh="http://schemas.microsoft.com/office/word/2020/wordml/sdtdatahash" xmlns:w16sdtfl="http://schemas.microsoft.com/office/word/2024/wordml/sdtformatlock" xmlns:w16se="http://schemas.microsoft.com/office/word/2015/wordml/symex" xmlns:w16du="http://schemas.microsoft.com/office/word/2023/wordml/word16du" xmlns:wne="http://schemas.microsoft.com/office/word/2006/wordml" mc:Ignorable="w14 w15 w16se w16cid w16 w16cex w16sdtdh w16sdtfl w16du wp14">
   <w:tbl>
     <w:tblPr>
       <w:tblStyle w:val="TableGrid"/>
@@ -8280,7 +8275,7 @@
 </file>
 
 <file path=word/footnotes.xml><?xml version="1.0" encoding="utf-8"?>
-<w:footnotes xmlns:wpc="http://schemas.microsoft.com/office/word/2010/wordprocessingCanvas" xmlns:cx="http://schemas.microsoft.com/office/drawing/2014/chartex" xmlns:cx1="http://schemas.microsoft.com/office/drawing/2015/9/8/chartex" xmlns:cx2="http://schemas.microsoft.com/office/drawing/2015/10/21/chartex" xmlns:cx3="http://schemas.microsoft.com/office/drawing/2016/5/9/chartex" xmlns:cx4="http://schemas.microsoft.com/office/drawing/2016/5/10/chartex" xmlns:cx5="http://schemas.microsoft.com/office/drawing/2016/5/11/chartex" xmlns:cx6="http://schemas.microsoft.com/office/drawing/2016/5/12/chartex" xmlns:cx7="http://schemas.microsoft.com/office/drawing/2016/5/13/chartex" xmlns:cx8="http://schemas.microsoft.com/office/drawing/2016/5/14/chartex" xmlns:mc="http://schemas.openxmlformats.org/markup-compatibility/2006" xmlns:m="http://schemas.openxmlformats.org/officeDocument/2006/math" xmlns:aink="http://schemas.microsoft.com/office/drawing/2016/ink" xmlns:am3d="http://schemas.microsoft.com/office/drawing/2017/model3d" xmlns:oel="http://schemas.microsoft.com/office/2019/extlst" xmlns:r="http://schemas.openxmlformats.org/officeDocument/2006/relationships" xmlns:wp14="http://schemas.microsoft.com/office/word/2010/wordprocessingDrawing" xmlns:wp="http://schemas.openxmlformats.org/drawingml/2006/wordprocessingDrawing" xmlns:wpg="http://schemas.microsoft.com/office/word/2010/wordprocessingGroup" xmlns:wpi="http://schemas.microsoft.com/office/word/2010/wordprocessingInk" xmlns:wps="http://schemas.microsoft.com/office/word/2010/wordprocessingShape" xmlns:o="urn:schemas-microsoft-com:office:office" xmlns:v="urn:schemas-microsoft-com:vml" xmlns:w10="urn:schemas-microsoft-com:office:word" xmlns:w="http://schemas.openxmlformats.org/wordprocessingml/2006/main" xmlns:w14="http://schemas.microsoft.com/office/word/2010/wordml" xmlns:w15="http://schemas.microsoft.com/office/word/2012/wordml" xmlns:w16cei="http://schemas.microsoft.com/office/word/2026/wordml/cei" xmlns:w16cex="http://schemas.microsoft.com/office/word/2018/wordml/cex" xmlns:w16cid="http://schemas.microsoft.com/office/word/2016/wordml/cid" xmlns:w16="http://schemas.microsoft.com/office/word/2018/wordml" xmlns:w16sdtdh="http://schemas.microsoft.com/office/word/2020/wordml/sdtdatahash" xmlns:w16sdtfl="http://schemas.microsoft.com/office/word/2024/wordml/sdtformatlock" xmlns:w16se="http://schemas.microsoft.com/office/word/2015/wordml/symex" xmlns:w16du="http://schemas.microsoft.com/office/word/2023/wordml/word16du" xmlns:wne="http://schemas.microsoft.com/office/word/2006/wordml" mc:Ignorable="w14 w15 w16se w16cid w16 w16cex w16sdtdh w16sdtfl w16du wp14">
+<w:footnotes xmlns:wpc="http://schemas.microsoft.com/office/word/2010/wordprocessingCanvas" xmlns:cx="http://schemas.microsoft.com/office/drawing/2014/chartex" xmlns:cx1="http://schemas.microsoft.com/office/drawing/2015/9/8/chartex" xmlns:cx2="http://schemas.microsoft.com/office/drawing/2015/10/21/chartex" xmlns:cx3="http://schemas.microsoft.com/office/drawing/2016/5/9/chartex" xmlns:cx4="http://schemas.microsoft.com/office/drawing/2016/5/10/chartex" xmlns:cx5="http://schemas.microsoft.com/office/drawing/2016/5/11/chartex" xmlns:cx6="http://schemas.microsoft.com/office/drawing/2016/5/12/chartex" xmlns:cx7="http://schemas.microsoft.com/office/drawing/2016/5/13/chartex" xmlns:cx8="http://schemas.microsoft.com/office/drawing/2016/5/14/chartex" xmlns:mc="http://schemas.openxmlformats.org/markup-compatibility/2006" xmlns:m="http://schemas.openxmlformats.org/officeDocument/2006/math" xmlns:aink="http://schemas.microsoft.com/office/drawing/2016/ink" xmlns:am3d="http://schemas.microsoft.com/office/drawing/2017/model3d" xmlns:oel="http://schemas.microsoft.com/office/2019/extlst" xmlns:r="http://schemas.openxmlformats.org/officeDocument/2006/relationships" xmlns:wp14="http://schemas.microsoft.com/office/word/2010/wordprocessingDrawing" xmlns:wp="http://schemas.openxmlformats.org/drawingml/2006/wordprocessingDrawing" xmlns:wpg="http://schemas.microsoft.com/office/word/2010/wordprocessingGroup" xmlns:wpi="http://schemas.microsoft.com/office/word/2010/wordprocessingInk" xmlns:wps="http://schemas.microsoft.com/office/word/2010/wordprocessingShape" xmlns:o="urn:schemas-microsoft-com:office:office" xmlns:v="urn:schemas-microsoft-com:vml" xmlns:w10="urn:schemas-microsoft-com:office:word" xmlns:w="http://schemas.openxmlformats.org/wordprocessingml/2006/main" xmlns:w14="http://schemas.microsoft.com/office/word/2010/wordml" xmlns:w15="http://schemas.microsoft.com/office/word/2012/wordml" xmlns:w16cex="http://schemas.microsoft.com/office/word/2018/wordml/cex" xmlns:w16cid="http://schemas.microsoft.com/office/word/2016/wordml/cid" xmlns:w16="http://schemas.microsoft.com/office/word/2018/wordml" xmlns:w16sdtdh="http://schemas.microsoft.com/office/word/2020/wordml/sdtdatahash" xmlns:w16sdtfl="http://schemas.microsoft.com/office/word/2024/wordml/sdtformatlock" xmlns:w16se="http://schemas.microsoft.com/office/word/2015/wordml/symex" xmlns:w16du="http://schemas.microsoft.com/office/word/2023/wordml/word16du" xmlns:wne="http://schemas.microsoft.com/office/word/2006/wordml" mc:Ignorable="w14 w15 w16se w16cid w16 w16cex w16sdtdh w16sdtfl w16du wp14">
   <w:footnote w:type="separator" w:id="-1">
     <w:p>
       <w:r>
@@ -8299,7 +8294,7 @@
 </file>
 
 <file path=word/header1.xml><?xml version="1.0" encoding="utf-8"?>
-<w:hdr xmlns:wpc="http://schemas.microsoft.com/office/word/2010/wordprocessingCanvas" xmlns:cx="http://schemas.microsoft.com/office/drawing/2014/chartex" xmlns:cx1="http://schemas.microsoft.com/office/drawing/2015/9/8/chartex" xmlns:cx2="http://schemas.microsoft.com/office/drawing/2015/10/21/chartex" xmlns:cx3="http://schemas.microsoft.com/office/drawing/2016/5/9/chartex" xmlns:cx4="http://schemas.microsoft.com/office/drawing/2016/5/10/chartex" xmlns:cx5="http://schemas.microsoft.com/office/drawing/2016/5/11/chartex" xmlns:cx6="http://schemas.microsoft.com/office/drawing/2016/5/12/chartex" xmlns:cx7="http://schemas.microsoft.com/office/drawing/2016/5/13/chartex" xmlns:cx8="http://schemas.microsoft.com/office/drawing/2016/5/14/chartex" xmlns:mc="http://schemas.openxmlformats.org/markup-compatibility/2006" xmlns:m="http://schemas.openxmlformats.org/officeDocument/2006/math" xmlns:aink="http://schemas.microsoft.com/office/drawing/2016/ink" xmlns:am3d="http://schemas.microsoft.com/office/drawing/2017/model3d" xmlns:oel="http://schemas.microsoft.com/office/2019/extlst" xmlns:r="http://schemas.openxmlformats.org/officeDocument/2006/relationships" xmlns:wp14="http://schemas.microsoft.com/office/word/2010/wordprocessingDrawing" xmlns:wp="http://schemas.openxmlformats.org/drawingml/2006/wordprocessingDrawing" xmlns:wpg="http://schemas.microsoft.com/office/word/2010/wordprocessingGroup" xmlns:wpi="http://schemas.microsoft.com/office/word/2010/wordprocessingInk" xmlns:wps="http://schemas.microsoft.com/office/word/2010/wordprocessingShape" xmlns:o="urn:schemas-microsoft-com:office:office" xmlns:v="urn:schemas-microsoft-com:vml" xmlns:w10="urn:schemas-microsoft-com:office:word" xmlns:w="http://schemas.openxmlformats.org/wordprocessingml/2006/main" xmlns:w14="http://schemas.microsoft.com/office/word/2010/wordml" xmlns:w15="http://schemas.microsoft.com/office/word/2012/wordml" xmlns:w16cei="http://schemas.microsoft.com/office/word/2026/wordml/cei" xmlns:w16cex="http://schemas.microsoft.com/office/word/2018/wordml/cex" xmlns:w16cid="http://schemas.microsoft.com/office/word/2016/wordml/cid" xmlns:w16="http://schemas.microsoft.com/office/word/2018/wordml" xmlns:w16sdtdh="http://schemas.microsoft.com/office/word/2020/wordml/sdtdatahash" xmlns:w16sdtfl="http://schemas.microsoft.com/office/word/2024/wordml/sdtformatlock" xmlns:w16se="http://schemas.microsoft.com/office/word/2015/wordml/symex" xmlns:w16du="http://schemas.microsoft.com/office/word/2023/wordml/word16du" xmlns:wne="http://schemas.microsoft.com/office/word/2006/wordml" mc:Ignorable="w14 w15 w16se w16cid w16 w16cex w16sdtdh w16sdtfl w16du wp14">
+<w:hdr xmlns:wpc="http://schemas.microsoft.com/office/word/2010/wordprocessingCanvas" xmlns:cx="http://schemas.microsoft.com/office/drawing/2014/chartex" xmlns:cx1="http://schemas.microsoft.com/office/drawing/2015/9/8/chartex" xmlns:cx2="http://schemas.microsoft.com/office/drawing/2015/10/21/chartex" xmlns:cx3="http://schemas.microsoft.com/office/drawing/2016/5/9/chartex" xmlns:cx4="http://schemas.microsoft.com/office/drawing/2016/5/10/chartex" xmlns:cx5="http://schemas.microsoft.com/office/drawing/2016/5/11/chartex" xmlns:cx6="http://schemas.microsoft.com/office/drawing/2016/5/12/chartex" xmlns:cx7="http://schemas.microsoft.com/office/drawing/2016/5/13/chartex" xmlns:cx8="http://schemas.microsoft.com/office/drawing/2016/5/14/chartex" xmlns:mc="http://schemas.openxmlformats.org/markup-compatibility/2006" xmlns:m="http://schemas.openxmlformats.org/officeDocument/2006/math" xmlns:aink="http://schemas.microsoft.com/office/drawing/2016/ink" xmlns:am3d="http://schemas.microsoft.com/office/drawing/2017/model3d" xmlns:oel="http://schemas.microsoft.com/office/2019/extlst" xmlns:r="http://schemas.openxmlformats.org/officeDocument/2006/relationships" xmlns:wp14="http://schemas.microsoft.com/office/word/2010/wordprocessingDrawing" xmlns:wp="http://schemas.openxmlformats.org/drawingml/2006/wordprocessingDrawing" xmlns:wpg="http://schemas.microsoft.com/office/word/2010/wordprocessingGroup" xmlns:wpi="http://schemas.microsoft.com/office/word/2010/wordprocessingInk" xmlns:wps="http://schemas.microsoft.com/office/word/2010/wordprocessingShape" xmlns:o="urn:schemas-microsoft-com:office:office" xmlns:v="urn:schemas-microsoft-com:vml" xmlns:w10="urn:schemas-microsoft-com:office:word" xmlns:w="http://schemas.openxmlformats.org/wordprocessingml/2006/main" xmlns:w14="http://schemas.microsoft.com/office/word/2010/wordml" xmlns:w15="http://schemas.microsoft.com/office/word/2012/wordml" xmlns:w16cex="http://schemas.microsoft.com/office/word/2018/wordml/cex" xmlns:w16cid="http://schemas.microsoft.com/office/word/2016/wordml/cid" xmlns:w16="http://schemas.microsoft.com/office/word/2018/wordml" xmlns:w16sdtdh="http://schemas.microsoft.com/office/word/2020/wordml/sdtdatahash" xmlns:w16sdtfl="http://schemas.microsoft.com/office/word/2024/wordml/sdtformatlock" xmlns:w16se="http://schemas.microsoft.com/office/word/2015/wordml/symex" xmlns:w16du="http://schemas.microsoft.com/office/word/2023/wordml/word16du" xmlns:wne="http://schemas.microsoft.com/office/word/2006/wordml" mc:Ignorable="w14 w15 w16se w16cid w16 w16cex w16sdtdh w16sdtfl w16du wp14">
   <w:p>
     <w:pPr>
       <w:pStyle w:val="Header"/>
@@ -8426,7 +8421,7 @@
         <w:sz w:val="20"/>
         <w:szCs w:val="20"/>
       </w:rPr>
-      <w:t>23</w:t>
+      <w:t>3</w:t>
     </w:r>
     <w:r>
       <w:rPr>
@@ -8442,7 +8437,7 @@
         <w:sz w:val="20"/>
         <w:szCs w:val="20"/>
       </w:rPr>
-      <w:t>7</w:t>
+      <w:t>9</w:t>
     </w:r>
     <w:r>
       <w:rPr>
@@ -8473,7 +8468,7 @@
 </file>
 
 <file path=word/numbering.xml><?xml version="1.0" encoding="utf-8"?>
-<w:numbering xmlns:wpc="http://schemas.microsoft.com/office/word/2010/wordprocessingCanvas" xmlns:cx="http://schemas.microsoft.com/office/drawing/2014/chartex" xmlns:cx1="http://schemas.microsoft.com/office/drawing/2015/9/8/chartex" xmlns:cx2="http://schemas.microsoft.com/office/drawing/2015/10/21/chartex" xmlns:cx3="http://schemas.microsoft.com/office/drawing/2016/5/9/chartex" xmlns:cx4="http://schemas.microsoft.com/office/drawing/2016/5/10/chartex" xmlns:cx5="http://schemas.microsoft.com/office/drawing/2016/5/11/chartex" xmlns:cx6="http://schemas.microsoft.com/office/drawing/2016/5/12/chartex" xmlns:cx7="http://schemas.microsoft.com/office/drawing/2016/5/13/chartex" xmlns:cx8="http://schemas.microsoft.com/office/drawing/2016/5/14/chartex" xmlns:mc="http://schemas.openxmlformats.org/markup-compatibility/2006" xmlns:m="http://schemas.openxmlformats.org/officeDocument/2006/math" xmlns:aink="http://schemas.microsoft.com/office/drawing/2016/ink" xmlns:am3d="http://schemas.microsoft.com/office/drawing/2017/model3d" xmlns:oel="http://schemas.microsoft.com/office/2019/extlst" xmlns:r="http://schemas.openxmlformats.org/officeDocument/2006/relationships" xmlns:wp14="http://schemas.microsoft.com/office/word/2010/wordprocessingDrawing" xmlns:wp="http://schemas.openxmlformats.org/drawingml/2006/wordprocessingDrawing" xmlns:wpg="http://schemas.microsoft.com/office/word/2010/wordprocessingGroup" xmlns:wpi="http://schemas.microsoft.com/office/word/2010/wordprocessingInk" xmlns:wps="http://schemas.microsoft.com/office/word/2010/wordprocessingShape" xmlns:o="urn:schemas-microsoft-com:office:office" xmlns:v="urn:schemas-microsoft-com:vml" xmlns:w10="urn:schemas-microsoft-com:office:word" xmlns:w="http://schemas.openxmlformats.org/wordprocessingml/2006/main" xmlns:w14="http://schemas.microsoft.com/office/word/2010/wordml" xmlns:w15="http://schemas.microsoft.com/office/word/2012/wordml" xmlns:w16cei="http://schemas.microsoft.com/office/word/2026/wordml/cei" xmlns:w16cex="http://schemas.microsoft.com/office/word/2018/wordml/cex" xmlns:w16cid="http://schemas.microsoft.com/office/word/2016/wordml/cid" xmlns:w16="http://schemas.microsoft.com/office/word/2018/wordml" xmlns:w16sdtdh="http://schemas.microsoft.com/office/word/2020/wordml/sdtdatahash" xmlns:w16sdtfl="http://schemas.microsoft.com/office/word/2024/wordml/sdtformatlock" xmlns:w16se="http://schemas.microsoft.com/office/word/2015/wordml/symex" xmlns:w16du="http://schemas.microsoft.com/office/word/2023/wordml/word16du" xmlns:wne="http://schemas.microsoft.com/office/word/2006/wordml" mc:Ignorable="w14 w15 w16se w16cid w16 w16cex w16sdtdh w16sdtfl w16du wp14">
+<w:numbering xmlns:wpc="http://schemas.microsoft.com/office/word/2010/wordprocessingCanvas" xmlns:cx="http://schemas.microsoft.com/office/drawing/2014/chartex" xmlns:cx1="http://schemas.microsoft.com/office/drawing/2015/9/8/chartex" xmlns:cx2="http://schemas.microsoft.com/office/drawing/2015/10/21/chartex" xmlns:cx3="http://schemas.microsoft.com/office/drawing/2016/5/9/chartex" xmlns:cx4="http://schemas.microsoft.com/office/drawing/2016/5/10/chartex" xmlns:cx5="http://schemas.microsoft.com/office/drawing/2016/5/11/chartex" xmlns:cx6="http://schemas.microsoft.com/office/drawing/2016/5/12/chartex" xmlns:cx7="http://schemas.microsoft.com/office/drawing/2016/5/13/chartex" xmlns:cx8="http://schemas.microsoft.com/office/drawing/2016/5/14/chartex" xmlns:mc="http://schemas.openxmlformats.org/markup-compatibility/2006" xmlns:m="http://schemas.openxmlformats.org/officeDocument/2006/math" xmlns:aink="http://schemas.microsoft.com/office/drawing/2016/ink" xmlns:am3d="http://schemas.microsoft.com/office/drawing/2017/model3d" xmlns:oel="http://schemas.microsoft.com/office/2019/extlst" xmlns:r="http://schemas.openxmlformats.org/officeDocument/2006/relationships" xmlns:wp14="http://schemas.microsoft.com/office/word/2010/wordprocessingDrawing" xmlns:wp="http://schemas.openxmlformats.org/drawingml/2006/wordprocessingDrawing" xmlns:wpg="http://schemas.microsoft.com/office/word/2010/wordprocessingGroup" xmlns:wpi="http://schemas.microsoft.com/office/word/2010/wordprocessingInk" xmlns:wps="http://schemas.microsoft.com/office/word/2010/wordprocessingShape" xmlns:o="urn:schemas-microsoft-com:office:office" xmlns:v="urn:schemas-microsoft-com:vml" xmlns:w10="urn:schemas-microsoft-com:office:word" xmlns:w="http://schemas.openxmlformats.org/wordprocessingml/2006/main" xmlns:w14="http://schemas.microsoft.com/office/word/2010/wordml" xmlns:w15="http://schemas.microsoft.com/office/word/2012/wordml" xmlns:w16cex="http://schemas.microsoft.com/office/word/2018/wordml/cex" xmlns:w16cid="http://schemas.microsoft.com/office/word/2016/wordml/cid" xmlns:w16="http://schemas.microsoft.com/office/word/2018/wordml" xmlns:w16sdtdh="http://schemas.microsoft.com/office/word/2020/wordml/sdtdatahash" xmlns:w16sdtfl="http://schemas.microsoft.com/office/word/2024/wordml/sdtformatlock" xmlns:w16se="http://schemas.microsoft.com/office/word/2015/wordml/symex" xmlns:w16du="http://schemas.microsoft.com/office/word/2023/wordml/word16du" xmlns:wne="http://schemas.microsoft.com/office/word/2006/wordml" mc:Ignorable="w14 w15 w16se w16cid w16 w16cex w16sdtdh w16sdtfl w16du wp14">
   <w:abstractNum w:abstractNumId="0" w15:restartNumberingAfterBreak="0">
     <w:nsid w:val="02E361A8"/>
     <w:multiLevelType w:val="hybridMultilevel"/>
@@ -11379,6 +11374,7 @@
   <w:style w:type="character" w:default="1" w:styleId="DefaultParagraphFont">
     <w:name w:val="Default Paragraph Font"/>
     <w:uiPriority w:val="1"/>
+    <w:semiHidden/>
     <w:unhideWhenUsed/>
   </w:style>
   <w:style w:type="table" w:default="1" w:styleId="TableNormal">

</xml_diff>